<commit_message>
Fix typo in documentation (Nuke)
</commit_message>
<xml_diff>
--- a/FLOMASTER_v2.0_DOC_EN.docx
+++ b/FLOMASTER_v2.0_DOC_EN.docx
@@ -203,7 +203,7 @@
           <w:sz w:val="21"/>
           <w:szCs w:val="21"/>
         </w:rPr>
-        <w:t xml:space="preserve">The launcher is fully self-contained and portable — you can move it to any drive or machine and everything will continue to work. OCIO config, settings, and presets are all inside one folder.</w:t>
+        <w:t xml:space="preserve">The launcher is fully self-contained and portable. You can move it to any drive or machine and everything will continue to work. OCIO config, settings, and presets are all inside one folder.</w:t>
       </w:r>
     </w:p>
     <w:p/>
@@ -388,7 +388,7 @@
           <w:sz w:val="21"/>
           <w:szCs w:val="21"/>
         </w:rPr>
-        <w:t xml:space="preserve">FLOMASTER supports 5 color schemes inspired by popular DCC software. Switch via Settings → Theme select. The theme persists between sessions.</w:t>
+        <w:t xml:space="preserve">FLOMASTER supports 5 color schemes inspired by popular DCC software. Switch via Settings. The theme persists between sessions.</w:t>
       </w:r>
     </w:p>
     <w:p/>
@@ -951,7 +951,7 @@
           <w:sz w:val="21"/>
           <w:szCs w:val="21"/>
         </w:rPr>
-        <w:t xml:space="preserve">Click Add → select .exe → enter name</w:t>
+        <w:t xml:space="preserve">Click Add, select .exe, enter name</w:t>
       </w:r>
     </w:p>
     <w:p>
@@ -970,7 +970,7 @@
           <w:sz w:val="21"/>
           <w:szCs w:val="21"/>
         </w:rPr>
-        <w:t xml:space="preserve">Drag &amp; drop .exe onto the launcher window</w:t>
+        <w:t xml:space="preserve">Drag and drop .exe onto the launcher window</w:t>
       </w:r>
     </w:p>
     <w:p/>
@@ -1136,7 +1136,7 @@
           <w:sz w:val="21"/>
           <w:szCs w:val="21"/>
         </w:rPr>
-        <w:t xml:space="preserve">Click + next to OCIO Config → select .ocio file → enter name.</w:t>
+        <w:t xml:space="preserve">Click + next to OCIO Config, select .ocio file, enter name.</w:t>
       </w:r>
     </w:p>
     <w:p/>
@@ -1173,7 +1173,7 @@
           <w:sz w:val="21"/>
           <w:szCs w:val="21"/>
         </w:rPr>
-        <w:t xml:space="preserve">Click − next to OCIO Config → confirm removal. Cannot remove the last config.</w:t>
+        <w:t xml:space="preserve">Click - next to OCIO Config and confirm removal. Cannot remove the last config.</w:t>
       </w:r>
     </w:p>
     <w:p/>
@@ -1210,7 +1210,7 @@
           <w:sz w:val="21"/>
           <w:szCs w:val="21"/>
         </w:rPr>
-        <w:t xml:space="preserve">In Settings → Default OCIO you can select the config used when launching from the system tray.</w:t>
+        <w:t xml:space="preserve">In Settings, Default OCIO lets you select the config used when launching from the system tray.</w:t>
       </w:r>
     </w:p>
     <w:p/>
@@ -1359,7 +1359,7 @@
           <w:sz w:val="32"/>
           <w:szCs w:val="32"/>
         </w:rPr>
-        <w:t xml:space="preserve">8. Drag &amp; Drop</w:t>
+        <w:t xml:space="preserve">8. Drag and Drop</w:t>
       </w:r>
     </w:p>
     <w:p>
@@ -1378,7 +1378,7 @@
           <w:sz w:val="21"/>
           <w:szCs w:val="21"/>
         </w:rPr>
-        <w:t xml:space="preserve">Drop .exe → create preset</w:t>
+        <w:t xml:space="preserve">Drop .exe to create preset</w:t>
       </w:r>
     </w:p>
     <w:p>
@@ -1397,7 +1397,7 @@
           <w:sz w:val="21"/>
           <w:szCs w:val="21"/>
         </w:rPr>
-        <w:t xml:space="preserve">Drop .blend/.spp/.ma/.hip/.nk → open in selected application</w:t>
+        <w:t xml:space="preserve">Drop .blend, .spp, .ma, .hip, .nk to open in selected application</w:t>
       </w:r>
     </w:p>
     <w:p/>
@@ -1434,7 +1434,7 @@
           <w:sz w:val="21"/>
           <w:szCs w:val="21"/>
         </w:rPr>
-        <w:t xml:space="preserve">Right-click on .blend, .spp, .ma, .mb, .hip, .nk files → "Open in FLOMASTER"</w:t>
+        <w:t xml:space="preserve">Right-click on .blend, .spp, .ma, .mb, .hip, .nk files and select Open in FLOMASTER.</w:t>
       </w:r>
     </w:p>
     <w:p/>
@@ -1765,7 +1765,7 @@
                 <w:sz w:val="20"/>
                 <w:szCs w:val="20"/>
               </w:rPr>
-              <w:t xml:space="preserve">Animated panel expand/collapse</w:t>
+              <w:t xml:space="preserve">Animated panel expand and collapse</w:t>
             </w:r>
           </w:p>
         </w:tc>
@@ -2903,7 +2903,7 @@
           <w:sz w:val="21"/>
           <w:szCs w:val="21"/>
         </w:rPr>
-        <w:t xml:space="preserve">powershell -ExecutionPolicy Bypass -File "path\to\launcher.ps1"</w:t>
+        <w:t xml:space="preserve">Run in terminal: powershell -ExecutionPolicy Bypass -File launcher.ps1</w:t>
       </w:r>
     </w:p>
     <w:p/>
@@ -2959,7 +2959,7 @@
           <w:sz w:val="21"/>
           <w:szCs w:val="21"/>
         </w:rPr>
-        <w:t xml:space="preserve">In Blender: Edit → Preferences → Color Management → OCIO</w:t>
+        <w:t xml:space="preserve">In Blender: Edit &gt; Preferences &gt; Color Management &gt; OCIO</w:t>
       </w:r>
     </w:p>
     <w:p/>
@@ -3034,7 +3034,7 @@
           <w:sz w:val="21"/>
           <w:szCs w:val="21"/>
         </w:rPr>
-        <w:t xml:space="preserve">Unreal Engine: pass argument -ocio="path\to\config.ocio"</w:t>
+        <w:t xml:space="preserve">Unreal Engine: pass argument -ocio=path/to/config.ocio</w:t>
       </w:r>
     </w:p>
     <w:p/>
@@ -3060,7 +3060,7 @@
           <w:sz w:val="20"/>
           <w:szCs w:val="20"/>
         </w:rPr>
-        <w:t xml:space="preserve">FLOMASTER v2.0 — OCIO Launcher</w:t>
+        <w:t xml:space="preserve">FLOMASTER v2.0 - OCIO Launcher</w:t>
       </w:r>
     </w:p>
     <w:sectPr>
@@ -3129,7 +3129,7 @@
         <w:sz w:val="16"/>
         <w:szCs w:val="16"/>
       </w:rPr>
-      <w:t xml:space="preserve">— </w:t>
+      <w:t xml:space="preserve">- </w:t>
     </w:r>
     <w:r>
       <w:rPr>
@@ -3150,7 +3150,7 @@
         <w:sz w:val="16"/>
         <w:szCs w:val="16"/>
       </w:rPr>
-      <w:t xml:space="preserve"> —</w:t>
+      <w:t xml:space="preserve"> -</w:t>
     </w:r>
   </w:p>
 </w:ftr>

</xml_diff>